<commit_message>
UPDATE : Sprint 2 -> Sprint 1
</commit_message>
<xml_diff>
--- a/docs/cadrage/customer-journey.docx
+++ b/docs/cadrage/customer-journey.docx
@@ -227,7 +227,19 @@
               <w:rPr>
                 <w:lang w:val="fr-FR"/>
               </w:rPr>
-              <w:t>Cadrage / Sprint 2 - post-perturbation J1 Produit / Scope</w:t>
+              <w:t xml:space="preserve">Cadrage / Sprint </w:t>
+            </w:r>
+            <w:r>
+              <w:rPr>
+                <w:lang w:val="fr-FR"/>
+              </w:rPr>
+              <w:t>2</w:t>
+            </w:r>
+            <w:r>
+              <w:rPr>
+                <w:lang w:val="fr-FR"/>
+              </w:rPr>
+              <w:t xml:space="preserve"> - post-perturbation J1 Produit / Scope</w:t>
             </w:r>
           </w:p>
         </w:tc>
@@ -365,9 +377,17 @@
       </w:pPr>
       <w:r>
         <w:fldChar w:fldCharType="begin"/>
+      </w:r>
+      <w:r>
         <w:instrText>TOC \o "1-3" \h \z \u</w:instrText>
+      </w:r>
+      <w:r>
         <w:fldChar w:fldCharType="separate"/>
+      </w:r>
+      <w:r>
         <w:t>(Table des matières non générée, appuyez sur F9 dans Word)</w:t>
+      </w:r>
+      <w:r>
         <w:fldChar w:fldCharType="end"/>
       </w:r>
     </w:p>
@@ -722,9 +742,11 @@
               <w:cnfStyle w:val="000000010000" w:firstRow="0" w:lastRow="0" w:firstColumn="0" w:lastColumn="0" w:oddVBand="0" w:evenVBand="0" w:oddHBand="0" w:evenHBand="1" w:firstRowFirstColumn="0" w:firstRowLastColumn="0" w:lastRowFirstColumn="0" w:lastRowLastColumn="0"/>
             </w:pPr>
             <w:r>
-              <w:t xml:space="preserve">Génère 3 quizz / semaine sur 5 chapitres différents pendant 2 semaines avant les partiels. Quand un QCM lui paraît douteux, pose la question à sa </w:t>
+              <w:t xml:space="preserve">Génère 3 quizz / semaine sur 5 chapitres différents pendant 2 semaines avant les partiels. </w:t>
+            </w:r>
+            <w:r>
               <w:lastRenderedPageBreak/>
-              <w:t>prof directement dans l'app.</w:t>
+              <w:t>Quand un QCM lui paraît douteux, pose la question à sa prof directement dans l'app.</w:t>
             </w:r>
           </w:p>
         </w:tc>
@@ -764,9 +786,11 @@
               <w:cnfStyle w:val="000000010000" w:firstRow="0" w:lastRow="0" w:firstColumn="0" w:lastColumn="0" w:oddVBand="0" w:evenVBand="0" w:oddHBand="0" w:evenHBand="1" w:firstRowFirstColumn="0" w:firstRowLastColumn="0" w:lastRowFirstColumn="0" w:lastRowLastColumn="0"/>
             </w:pPr>
             <w:r>
-              <w:t xml:space="preserve">🚧 Friction : pas d'historique consultable hors-ligne. 💡 Opportunité : mode hors-ligne pour le RER. 💡 Opportunité : fil de questions </w:t>
+              <w:t>🚧 Friction : pas d'historique consultable hors-ligne. 💡 Opportunité : mode hors-</w:t>
+            </w:r>
+            <w:r>
               <w:lastRenderedPageBreak/>
-              <w:t>élève → prof intégré.</w:t>
+              <w:t>ligne pour le RER. 💡 Opportunité : fil de questions élève → prof intégré.</w:t>
             </w:r>
           </w:p>
         </w:tc>
@@ -1127,7 +1151,11 @@
               <w:cnfStyle w:val="000000100000" w:firstRow="0" w:lastRow="0" w:firstColumn="0" w:lastColumn="0" w:oddVBand="0" w:evenVBand="0" w:oddHBand="1" w:evenHBand="0" w:firstRowFirstColumn="0" w:firstRowLastColumn="0" w:lastRowFirstColumn="0" w:lastRowLastColumn="0"/>
             </w:pPr>
             <w:r>
-              <w:t>Uploade un cours de Communication non-verbale. Génère 1 quiz de 10 QCM pour tester. Crée une ou plusieurs classes (un code par groupe) et transmet chaque code aux étudiants concernés pour les lier au bon cours.</w:t>
+              <w:t xml:space="preserve">Uploade un cours de Communication </w:t>
+            </w:r>
+            <w:r>
+              <w:lastRenderedPageBreak/>
+              <w:t>non-verbale. Génère 1 quiz de 10 QCM pour tester. Crée une ou plusieurs classes (un code par groupe) et transmet chaque code aux étudiants concernés pour les lier au bon cours.</w:t>
             </w:r>
           </w:p>
         </w:tc>
@@ -1140,7 +1168,12 @@
               <w:cnfStyle w:val="000000100000" w:firstRow="0" w:lastRow="0" w:firstColumn="0" w:lastColumn="0" w:oddVBand="0" w:evenVBand="0" w:oddHBand="1" w:evenHBand="0" w:firstRowFirstColumn="0" w:firstRowLastColumn="0" w:lastRowFirstColumn="0" w:lastRowLastColumn="0"/>
             </w:pPr>
             <w:r>
-              <w:t>« Si les questions sont mal formulées ou fausses, je n'y reviens pas. »</w:t>
+              <w:lastRenderedPageBreak/>
+              <w:t xml:space="preserve">« Si les questions sont mal formulées </w:t>
+            </w:r>
+            <w:r>
+              <w:lastRenderedPageBreak/>
+              <w:t>ou fausses, je n'y reviens pas. »</w:t>
             </w:r>
           </w:p>
         </w:tc>
@@ -1153,6 +1186,7 @@
               <w:cnfStyle w:val="000000100000" w:firstRow="0" w:lastRow="0" w:firstColumn="0" w:lastColumn="0" w:oddVBand="0" w:evenVBand="0" w:oddHBand="1" w:evenHBand="0" w:firstRowFirstColumn="0" w:firstRowLastColumn="0" w:lastRowFirstColumn="0" w:lastRowLastColumn="0"/>
             </w:pPr>
             <w:r>
+              <w:lastRenderedPageBreak/>
               <w:t>😐 Vigilante → 😊 Étonnée</w:t>
             </w:r>
           </w:p>
@@ -1166,9 +1200,11 @@
               <w:cnfStyle w:val="000000100000" w:firstRow="0" w:lastRow="0" w:firstColumn="0" w:lastColumn="0" w:oddVBand="0" w:evenVBand="0" w:oddHBand="1" w:evenHBand="0" w:firstRowFirstColumn="0" w:firstRowLastColumn="0" w:lastRowFirstColumn="0" w:lastRowLastColumn="0"/>
             </w:pPr>
             <w:r>
-              <w:t xml:space="preserve">🚧 Friction : pas d'aperçu rapide des questions. 💡 Opportunité : mode preview avant </w:t>
+              <w:t xml:space="preserve">🚧 Friction : pas d'aperçu rapide des </w:t>
+            </w:r>
+            <w:r>
               <w:lastRenderedPageBreak/>
-              <w:t>publication.</w:t>
+              <w:t>questions. 💡 Opportunité : mode preview avant publication.</w:t>
             </w:r>
           </w:p>
         </w:tc>
@@ -1316,6 +1352,7 @@
         <w:rPr>
           <w:b/>
         </w:rPr>
+        <w:lastRenderedPageBreak/>
         <w:t xml:space="preserve">Moment de décrochage potentiel identifié : </w:t>
       </w:r>
       <w:r>
@@ -1584,7 +1621,6 @@
           </w:tcPr>
           <w:p>
             <w:r>
-              <w:lastRenderedPageBreak/>
               <w:t>3. Décision</w:t>
             </w:r>
           </w:p>
@@ -1734,7 +1770,11 @@
               <w:cnfStyle w:val="000000100000" w:firstRow="0" w:lastRow="0" w:firstColumn="0" w:lastColumn="0" w:oddVBand="0" w:evenVBand="0" w:oddHBand="1" w:evenHBand="0" w:firstRowFirstColumn="0" w:firstRowLastColumn="0" w:lastRowFirstColumn="0" w:lastRowLastColumn="0"/>
             </w:pPr>
             <w:r>
-              <w:t>Mesure l'adoption en fin d'année 1 : 35 % des profs actifs, 80 % des étudiants ont utilisé au moins 1 fois.</w:t>
+              <w:t xml:space="preserve">Mesure l'adoption en fin d'année 1 : 35 % des profs actifs, 80 % des </w:t>
+            </w:r>
+            <w:r>
+              <w:lastRenderedPageBreak/>
+              <w:t>étudiants ont utilisé au moins 1 fois.</w:t>
             </w:r>
           </w:p>
         </w:tc>
@@ -1747,7 +1787,12 @@
               <w:cnfStyle w:val="000000100000" w:firstRow="0" w:lastRow="0" w:firstColumn="0" w:lastColumn="0" w:oddVBand="0" w:evenVBand="0" w:oddHBand="1" w:evenHBand="0" w:firstRowFirstColumn="0" w:firstRowLastColumn="0" w:lastRowFirstColumn="0" w:lastRowLastColumn="0"/>
             </w:pPr>
             <w:r>
-              <w:t>« 35 % d'adoption profs = au-dessus du seuil de 30 %. Je peux dire au CA on est en avance sur l'IA sans mentir. »</w:t>
+              <w:lastRenderedPageBreak/>
+              <w:t xml:space="preserve">« 35 % d'adoption profs = au-dessus du seuil de 30 %. Je </w:t>
+            </w:r>
+            <w:r>
+              <w:lastRenderedPageBreak/>
+              <w:t>peux dire au CA on est en avance sur l'IA sans mentir. »</w:t>
             </w:r>
           </w:p>
         </w:tc>
@@ -1760,6 +1805,7 @@
               <w:cnfStyle w:val="000000100000" w:firstRow="0" w:lastRow="0" w:firstColumn="0" w:lastColumn="0" w:oddVBand="0" w:evenVBand="0" w:oddHBand="1" w:evenHBand="0" w:firstRowFirstColumn="0" w:firstRowLastColumn="0" w:lastRowFirstColumn="0" w:lastRowLastColumn="0"/>
             </w:pPr>
             <w:r>
+              <w:lastRenderedPageBreak/>
               <w:t>😊 Confiant, fier</w:t>
             </w:r>
           </w:p>
@@ -1773,7 +1819,11 @@
               <w:cnfStyle w:val="000000100000" w:firstRow="0" w:lastRow="0" w:firstColumn="0" w:lastColumn="0" w:oddVBand="0" w:evenVBand="0" w:oddHBand="1" w:evenHBand="0" w:firstRowFirstColumn="0" w:firstRowLastColumn="0" w:lastRowFirstColumn="0" w:lastRowLastColumn="0"/>
             </w:pPr>
             <w:r>
-              <w:t>🚧 Friction : pas de comparaison anonymisée avec d'autres écoles. 💡 Opportunité : benchmark sectoriel.</w:t>
+              <w:t xml:space="preserve">🚧 Friction : pas de comparaison anonymisée avec d'autres </w:t>
+            </w:r>
+            <w:r>
+              <w:lastRenderedPageBreak/>
+              <w:t>écoles. 💡 Opportunité : benchmark sectoriel.</w:t>
             </w:r>
           </w:p>
         </w:tc>
@@ -1784,6 +1834,7 @@
         <w:rPr>
           <w:b/>
         </w:rPr>
+        <w:lastRenderedPageBreak/>
         <w:t xml:space="preserve">Moment de décrochage potentiel identifié : </w:t>
       </w:r>
       <w:r>
@@ -2168,7 +2219,6 @@
         <w:rPr>
           <w:b/>
         </w:rPr>
-        <w:lastRenderedPageBreak/>
         <w:t xml:space="preserve">Investissement produit prioritaire </w:t>
       </w:r>
       <w:r>

</xml_diff>